<commit_message>
Update Documentos UI to 2 columns and fix generic template tags
</commit_message>
<xml_diff>
--- a/public/templates/Pedidos_SIGA_compra_bienes_servicios.docx
+++ b/public/templates/Pedidos_SIGA_compra_bienes_servicios.docx
@@ -177,6 +177,8 @@
         <w:jc w:val="both"/>
         <w:rPr>
           <w:rFonts w:ascii="Arial" w:hAnsi="Arial" w:cs="Arial"/>
+          <w:b/>
+          <w:bCs/>
           <w:sz w:val="20"/>
           <w:szCs w:val="20"/>
         </w:rPr>
@@ -189,7 +191,7 @@
           <w:szCs w:val="20"/>
           <w:lang w:val="pt-BR"/>
         </w:rPr>
-        <w:t xml:space="preserve">A                          :  </w:t>
+        <w:t xml:space="preserve">A                         </w:t>
       </w:r>
       <w:r>
         <w:rPr>
@@ -204,6 +206,18 @@
       <w:r>
         <w:rPr>
           <w:rFonts w:ascii="Arial" w:hAnsi="Arial" w:cs="Arial"/>
+          <w:b/>
+          <w:sz w:val="20"/>
+          <w:szCs w:val="20"/>
+          <w:lang w:val="pt-BR"/>
+        </w:rPr>
+        <w:t xml:space="preserve">:   </w:t>
+      </w:r>
+      <w:r>
+        <w:rPr>
+          <w:rFonts w:ascii="Arial" w:hAnsi="Arial" w:cs="Arial"/>
+          <w:b/>
+          <w:bCs/>
           <w:sz w:val="20"/>
           <w:szCs w:val="20"/>
           <w:lang w:val="pt-BR"/>
@@ -222,6 +236,8 @@
         <w:jc w:val="both"/>
         <w:rPr>
           <w:rFonts w:ascii="Arial" w:hAnsi="Arial" w:cs="Arial"/>
+          <w:b/>
+          <w:bCs/>
           <w:sz w:val="20"/>
           <w:szCs w:val="20"/>
         </w:rPr>
@@ -232,7 +248,17 @@
           <w:sz w:val="20"/>
           <w:szCs w:val="20"/>
         </w:rPr>
-        <w:t xml:space="preserve">                                Jefe de la Oficina de Logística</w:t>
+        <w:t xml:space="preserve">                                </w:t>
+      </w:r>
+      <w:r>
+        <w:rPr>
+          <w:rFonts w:ascii="Arial" w:hAnsi="Arial" w:cs="Arial"/>
+          <w:b/>
+          <w:bCs/>
+          <w:sz w:val="20"/>
+          <w:szCs w:val="20"/>
+        </w:rPr>
+        <w:t>Jefe de la Oficina de Logística</w:t>
       </w:r>
     </w:p>
     <w:p>
@@ -274,7 +300,7 @@
           <w:sz w:val="20"/>
           <w:szCs w:val="20"/>
         </w:rPr>
-        <w:t>ASUNTO             :    REMITE PEDIDO</w:t>
+        <w:t xml:space="preserve">ASUNTO             :    </w:t>
       </w:r>
       <w:r>
         <w:rPr>
@@ -283,34 +309,7 @@
           <w:sz w:val="20"/>
           <w:szCs w:val="20"/>
         </w:rPr>
-        <w:t xml:space="preserve"> DE</w:t>
-      </w:r>
-      <w:r>
-        <w:rPr>
-          <w:rFonts w:ascii="Arial" w:hAnsi="Arial" w:cs="Arial"/>
-          <w:b/>
-          <w:sz w:val="20"/>
-          <w:szCs w:val="20"/>
-        </w:rPr>
-        <w:t xml:space="preserve"> COMPRA</w:t>
-      </w:r>
-      <w:r>
-        <w:rPr>
-          <w:rFonts w:ascii="Arial" w:hAnsi="Arial" w:cs="Arial"/>
-          <w:b/>
-          <w:sz w:val="20"/>
-          <w:szCs w:val="20"/>
-        </w:rPr>
-        <w:t xml:space="preserve"> DE</w:t>
-      </w:r>
-      <w:r>
-        <w:rPr>
-          <w:rFonts w:ascii="Arial" w:hAnsi="Arial" w:cs="Arial"/>
-          <w:b/>
-          <w:sz w:val="20"/>
-          <w:szCs w:val="20"/>
-        </w:rPr>
-        <w:t xml:space="preserve"> </w:t>
+        <w:t xml:space="preserve">Remite Pedido De Compra de </w:t>
       </w:r>
       <w:r>
         <w:rPr>
@@ -395,15 +394,17 @@
           <w:sz w:val="20"/>
           <w:szCs w:val="20"/>
         </w:rPr>
-        <w:t xml:space="preserve">   </w:t>
+        <w:t xml:space="preserve">     </w:t>
       </w:r>
       <w:r>
         <w:rPr>
           <w:rFonts w:ascii="Arial" w:hAnsi="Arial" w:cs="Arial"/>
+          <w:b/>
+          <w:bCs/>
           <w:sz w:val="20"/>
           <w:szCs w:val="20"/>
         </w:rPr>
-        <w:t xml:space="preserve">  </w:t>
+        <w:t>:</w:t>
       </w:r>
       <w:r>
         <w:rPr>
@@ -411,20 +412,35 @@
           <w:sz w:val="20"/>
           <w:szCs w:val="20"/>
         </w:rPr>
-        <w:t xml:space="preserve">:    </w:t>
+        <w:t xml:space="preserve">    </w:t>
       </w:r>
       <w:r>
         <w:rPr>
           <w:rFonts w:ascii="Arial" w:hAnsi="Arial" w:cs="Arial"/>
+          <w:b/>
+          <w:bCs/>
           <w:sz w:val="20"/>
           <w:szCs w:val="20"/>
           <w:lang w:val="es-PE"/>
         </w:rPr>
-        <w:t>NOTA DE COORDINACIÓN N°</w:t>
+        <w:t>Nota De Coordinación N°</w:t>
       </w:r>
       <w:r>
         <w:rPr>
           <w:rFonts w:ascii="Arial" w:hAnsi="Arial" w:cs="Arial"/>
+          <w:b/>
+          <w:bCs/>
+          <w:sz w:val="20"/>
+          <w:szCs w:val="20"/>
+          <w:lang w:val="es-PE"/>
+        </w:rPr>
+        <w:t xml:space="preserve"> </w:t>
+      </w:r>
+      <w:r>
+        <w:rPr>
+          <w:rFonts w:ascii="Arial" w:hAnsi="Arial" w:cs="Arial"/>
+          <w:b/>
+          <w:bCs/>
           <w:color w:val="EE0000"/>
           <w:sz w:val="20"/>
           <w:szCs w:val="20"/>
@@ -436,6 +452,8 @@
       <w:r>
         <w:rPr>
           <w:rFonts w:ascii="Arial" w:hAnsi="Arial" w:cs="Arial"/>
+          <w:b/>
+          <w:bCs/>
           <w:color w:val="EE0000"/>
           <w:sz w:val="20"/>
           <w:szCs w:val="20"/>
@@ -447,6 +465,8 @@
       <w:r>
         <w:rPr>
           <w:rFonts w:ascii="Arial" w:hAnsi="Arial" w:cs="Arial"/>
+          <w:b/>
+          <w:bCs/>
           <w:color w:val="EE0000"/>
           <w:sz w:val="20"/>
           <w:szCs w:val="20"/>
@@ -457,11 +477,37 @@
       <w:r>
         <w:rPr>
           <w:rFonts w:ascii="Arial" w:hAnsi="Arial" w:cs="Arial"/>
+          <w:b/>
+          <w:bCs/>
           <w:sz w:val="20"/>
           <w:szCs w:val="20"/>
           <w:lang w:val="es-PE"/>
         </w:rPr>
-        <w:t>- OGESS-ESPECIALIZADA/LOG</w:t>
+        <w:t xml:space="preserve">- </w:t>
+      </w:r>
+      <w:proofErr w:type="spellStart"/>
+      <w:r>
+        <w:rPr>
+          <w:rFonts w:ascii="Arial" w:hAnsi="Arial" w:cs="Arial"/>
+          <w:b/>
+          <w:bCs/>
+          <w:sz w:val="20"/>
+          <w:szCs w:val="20"/>
+          <w:lang w:val="es-PE"/>
+        </w:rPr>
+        <w:t>Ogess</w:t>
+      </w:r>
+      <w:proofErr w:type="spellEnd"/>
+      <w:r>
+        <w:rPr>
+          <w:rFonts w:ascii="Arial" w:hAnsi="Arial" w:cs="Arial"/>
+          <w:b/>
+          <w:bCs/>
+          <w:sz w:val="20"/>
+          <w:szCs w:val="20"/>
+          <w:lang w:val="es-PE"/>
+        </w:rPr>
+        <w:t>-Especializada/Log</w:t>
       </w:r>
     </w:p>
     <w:p>
@@ -496,20 +542,13 @@
           <w:sz w:val="20"/>
           <w:szCs w:val="20"/>
         </w:rPr>
-        <w:t xml:space="preserve">FECHA                : </w:t>
+        <w:t xml:space="preserve">FECHA                :    </w:t>
       </w:r>
       <w:r>
         <w:rPr>
           <w:rFonts w:ascii="Arial" w:hAnsi="Arial" w:cs="Arial"/>
           <w:b/>
-          <w:sz w:val="20"/>
-          <w:szCs w:val="20"/>
-        </w:rPr>
-        <w:t xml:space="preserve">   </w:t>
-      </w:r>
-      <w:r>
-        <w:rPr>
-          <w:rFonts w:ascii="Arial" w:hAnsi="Arial" w:cs="Arial"/>
+          <w:bCs/>
           <w:color w:val="EE0000"/>
           <w:sz w:val="20"/>
           <w:szCs w:val="20"/>
@@ -1170,7 +1209,7 @@
                                     <pic:cNvPicPr/>
                                   </pic:nvPicPr>
                                   <pic:blipFill>
-                                    <a:blip r:embed="rId1"/>
+                                    <a:blip r:embed="rId2"/>
                                     <a:srcRect/>
                                     <a:stretch>
                                       <a:fillRect/>

</xml_diff>